<commit_message>
feat: Sprint 5E-F — sistem durum UI, Gemini 2.5 Flash, 53 test belgesi, tarih hizalama
- Katman C: gemini-2.0-flash → gemini-2.5-flash (yeni hesaplarda sıfır kota sorunu)
- Sistem durum paneli: 3 katmanın anlık durumu, kota önbellekleme
- API key hot-reload: /admin/set-api-key + data/api_config.json + pipeline.reload_layer_c()
- /status ve /check-api-key endpoint'leri eklendi
- Test belgeleri (53): Sayı/Tarih satırı spaces → right-tab stop (10206 twip @ 18cm)
- README kapsamlı yeniden yazıldı: 21 kural, 6 RAG kaynağı, TDK scraping, API referansı
</commit_message>
<xml_diff>
--- a/backend/tests/fixtures/a_cls001_no_closing.docx
+++ b/backend/tests/fixtures/a_cls001_no_closing.docx
@@ -43,15 +43,30 @@
     </w:p>
     <w:p>
       <w:pPr>
-        <w:jc w:val="left"/>
+        <w:tabs>
+          <w:tab w:val="right" w:pos="10206"/>
+        </w:tabs>
       </w:pPr>
       <w:r>
         <w:rPr>
           <w:rFonts w:ascii="Times New Roman" w:hAnsi="Times New Roman"/>
-          <w:b w:val="0"/>
           <w:sz w:val="24"/>
         </w:rPr>
-        <w:t>Sayı: F.01.2-2025/042                    Tarih: 26.05.2025</w:t>
+        <w:t>Sayı: F.01.2-2025/042</w:t>
+      </w:r>
+      <w:r>
+        <w:rPr>
+          <w:rFonts w:ascii="Times New Roman" w:hAnsi="Times New Roman"/>
+          <w:sz w:val="24"/>
+        </w:rPr>
+        <w:tab/>
+      </w:r>
+      <w:r>
+        <w:rPr>
+          <w:rFonts w:ascii="Times New Roman" w:hAnsi="Times New Roman"/>
+          <w:sz w:val="24"/>
+        </w:rPr>
+        <w:t>Tarih: 26.05.2025</w:t>
       </w:r>
     </w:p>
     <w:p>

</xml_diff>